<commit_message>
Lab 4: replace generated figures with real MySQL Workbench screenshots
Co-Authored-By: Claude Opus 5.5 <noreply@anthropic.com>
Claude-Session: https://claude.ai/code/session_017QWbe1cP1bYnXrUNjtuuoW
</commit_message>
<xml_diff>
--- a/lab4/Лабораторна_робота_4.docx
+++ b/lab4/Лабораторна_робота_4.docx
@@ -107,7 +107,166 @@
         <w:t>Підключення до сервера.</w:t>
       </w:r>
       <w:r>
-        <w:t xml:space="preserve"> Роботу виконано в MySQL Workbench. На головному вікні в блоці SQL Development (MySQL Connections) обрано «New Connection» та задано параметри нового з’єднання: Connection Name – library, Connection Method – Standard (TCP/IP), Hostname – 127.0.0.1, Port – 3306, Username – root. Пароль збережено кнопкою «Store in Vault», після чого правильність параметрів перевірено кнопкою «Test Connection» та підтверджено кнопкою OK. Подвійним клацанням по створеному з’єднанню відкрито вкладку SQL Editor.</w:t>
+        <w:t xml:space="preserve"> Роботу виконано в MySQL Workbench. На головному вікні в блоці SQL Development (MySQL Connections) обрано «New Connection» та задано параметри нового з’єднання: Connection Name – library, Connection Method – Standard (TCP/IP), Hostname – 127.0.0.1, Port – 3306, Username – root. Пароль введено та збережено (Save password in keychain), після чого правильність параметрів перевірено кнопкою «Test Connection» та підтверджено кнопкою OK. Подвійним клацанням по створеному з’єднанню відкрито вкладку SQL Editor.</w:t>
+      </w:r>
+    </w:p>
+    <w:p>
+      <w:pPr>
+        <w:spacing w:before="120"/>
+        <w:jc w:val="center"/>
+      </w:pPr>
+      <w:r>
+        <w:drawing>
+          <wp:inline xmlns:a="http://schemas.openxmlformats.org/drawingml/2006/main" xmlns:pic="http://schemas.openxmlformats.org/drawingml/2006/picture">
+            <wp:extent cx="5760000" cy="2232000"/>
+            <wp:docPr id="1" name="Picture 1"/>
+            <wp:cNvGraphicFramePr>
+              <a:graphicFrameLocks noChangeAspect="1"/>
+            </wp:cNvGraphicFramePr>
+            <a:graphic>
+              <a:graphicData uri="http://schemas.openxmlformats.org/drawingml/2006/picture">
+                <pic:pic>
+                  <pic:nvPicPr>
+                    <pic:cNvPr id="0" name="01_home.png"/>
+                    <pic:cNvPicPr/>
+                  </pic:nvPicPr>
+                  <pic:blipFill>
+                    <a:blip r:embed="rId9"/>
+                    <a:stretch>
+                      <a:fillRect/>
+                    </a:stretch>
+                  </pic:blipFill>
+                  <pic:spPr>
+                    <a:xfrm>
+                      <a:off x="0" y="0"/>
+                      <a:ext cx="5760000" cy="2232000"/>
+                    </a:xfrm>
+                    <a:prstGeom prst="rect"/>
+                  </pic:spPr>
+                </pic:pic>
+              </a:graphicData>
+            </a:graphic>
+          </wp:inline>
+        </w:drawing>
+      </w:r>
+    </w:p>
+    <w:p>
+      <w:pPr>
+        <w:spacing w:after="160"/>
+        <w:jc w:val="center"/>
+      </w:pPr>
+      <w:r>
+        <w:rPr>
+          <w:b w:val="0"/>
+          <w:i w:val="0"/>
+        </w:rPr>
+        <w:t>Рисунок 1 – Головне вікно MySQL Workbench зі створеним з’єднанням library</w:t>
+      </w:r>
+    </w:p>
+    <w:p>
+      <w:pPr>
+        <w:spacing w:before="120"/>
+        <w:jc w:val="center"/>
+      </w:pPr>
+      <w:r>
+        <w:drawing>
+          <wp:inline xmlns:a="http://schemas.openxmlformats.org/drawingml/2006/main" xmlns:pic="http://schemas.openxmlformats.org/drawingml/2006/picture">
+            <wp:extent cx="4680000" cy="3347015"/>
+            <wp:docPr id="2" name="Picture 2"/>
+            <wp:cNvGraphicFramePr>
+              <a:graphicFrameLocks noChangeAspect="1"/>
+            </wp:cNvGraphicFramePr>
+            <a:graphic>
+              <a:graphicData uri="http://schemas.openxmlformats.org/drawingml/2006/picture">
+                <pic:pic>
+                  <pic:nvPicPr>
+                    <pic:cNvPr id="0" name="02_connection.png"/>
+                    <pic:cNvPicPr/>
+                  </pic:nvPicPr>
+                  <pic:blipFill>
+                    <a:blip r:embed="rId10"/>
+                    <a:stretch>
+                      <a:fillRect/>
+                    </a:stretch>
+                  </pic:blipFill>
+                  <pic:spPr>
+                    <a:xfrm>
+                      <a:off x="0" y="0"/>
+                      <a:ext cx="4680000" cy="3347015"/>
+                    </a:xfrm>
+                    <a:prstGeom prst="rect"/>
+                  </pic:spPr>
+                </pic:pic>
+              </a:graphicData>
+            </a:graphic>
+          </wp:inline>
+        </w:drawing>
+      </w:r>
+    </w:p>
+    <w:p>
+      <w:pPr>
+        <w:spacing w:after="160"/>
+        <w:jc w:val="center"/>
+      </w:pPr>
+      <w:r>
+        <w:rPr>
+          <w:b w:val="0"/>
+          <w:i w:val="0"/>
+        </w:rPr>
+        <w:t>Рисунок 2 – Вікно налаштування властивостей нового з’єднання (Setup New Connection)</w:t>
+      </w:r>
+    </w:p>
+    <w:p>
+      <w:pPr>
+        <w:spacing w:before="120"/>
+        <w:jc w:val="center"/>
+      </w:pPr>
+      <w:r>
+        <w:drawing>
+          <wp:inline xmlns:a="http://schemas.openxmlformats.org/drawingml/2006/main" xmlns:pic="http://schemas.openxmlformats.org/drawingml/2006/picture">
+            <wp:extent cx="4680000" cy="3347015"/>
+            <wp:docPr id="3" name="Picture 3"/>
+            <wp:cNvGraphicFramePr>
+              <a:graphicFrameLocks noChangeAspect="1"/>
+            </wp:cNvGraphicFramePr>
+            <a:graphic>
+              <a:graphicData uri="http://schemas.openxmlformats.org/drawingml/2006/picture">
+                <pic:pic>
+                  <pic:nvPicPr>
+                    <pic:cNvPr id="0" name="03_test_connection.png"/>
+                    <pic:cNvPicPr/>
+                  </pic:nvPicPr>
+                  <pic:blipFill>
+                    <a:blip r:embed="rId11"/>
+                    <a:stretch>
+                      <a:fillRect/>
+                    </a:stretch>
+                  </pic:blipFill>
+                  <pic:spPr>
+                    <a:xfrm>
+                      <a:off x="0" y="0"/>
+                      <a:ext cx="4680000" cy="3347015"/>
+                    </a:xfrm>
+                    <a:prstGeom prst="rect"/>
+                  </pic:spPr>
+                </pic:pic>
+              </a:graphicData>
+            </a:graphic>
+          </wp:inline>
+        </w:drawing>
+      </w:r>
+    </w:p>
+    <w:p>
+      <w:pPr>
+        <w:spacing w:after="160"/>
+        <w:jc w:val="center"/>
+      </w:pPr>
+      <w:r>
+        <w:rPr>
+          <w:b w:val="0"/>
+          <w:i w:val="0"/>
+        </w:rPr>
+        <w:t>Рисунок 3 – Перевірка з’єднання кнопкою Test Connection</w:t>
       </w:r>
     </w:p>
     <w:p>
@@ -128,7 +287,7 @@
         <w:t>Створення бази даних.</w:t>
       </w:r>
       <w:r>
-        <w:t xml:space="preserve"> Нову схему створено кнопкою «Create New Schema» (Створити нову БД) на панелі інструментів. У полі Name вказано library4, кодування – utf8mb4 (для коректного збереження українських літер). Після натискання Apply Workbench сформував SQL-скрипт, який було застосовано кнопкою Apply у вікні «Apply SQL Script to Database». У результаті в списку SCHEMAS з’явилася нова схема library4, яку зроблено активною (Set as Default Schema).</w:t>
+        <w:t xml:space="preserve"> Нову схему створено кнопкою «Create New Schema» (Створити нову БД) на панелі інструментів. У полі Schema Name вказано library4, кодування залишено за замовчуванням (у MySQL 8 це utf8mb4, що коректно зберігає українські літери). Після натискання Apply Workbench сформував SQL-скрипт, який було застосовано кнопкою Apply у вікні «Apply SQL Script to Database». У результаті в списку SCHEMAS з’явилася нова схема library4, яку зроблено активною (подвійне клацання – назва виділяється жирним).</w:t>
       </w:r>
     </w:p>
     <w:p>
@@ -139,8 +298,8 @@
       <w:r>
         <w:drawing>
           <wp:inline xmlns:a="http://schemas.openxmlformats.org/drawingml/2006/main" xmlns:pic="http://schemas.openxmlformats.org/drawingml/2006/picture">
-            <wp:extent cx="5400000" cy="518978"/>
-            <wp:docPr id="1" name="Picture 1"/>
+            <wp:extent cx="5760000" cy="1728000"/>
+            <wp:docPr id="4" name="Picture 4"/>
             <wp:cNvGraphicFramePr>
               <a:graphicFrameLocks noChangeAspect="1"/>
             </wp:cNvGraphicFramePr>
@@ -148,11 +307,11 @@
               <a:graphicData uri="http://schemas.openxmlformats.org/drawingml/2006/picture">
                 <pic:pic>
                   <pic:nvPicPr>
-                    <pic:cNvPr id="0" name="f01_schema.png"/>
+                    <pic:cNvPr id="0" name="04_new_schema.png"/>
                     <pic:cNvPicPr/>
                   </pic:nvPicPr>
                   <pic:blipFill>
-                    <a:blip r:embed="rId9"/>
+                    <a:blip r:embed="rId12"/>
                     <a:stretch>
                       <a:fillRect/>
                     </a:stretch>
@@ -160,7 +319,7 @@
                   <pic:spPr>
                     <a:xfrm>
                       <a:off x="0" y="0"/>
-                      <a:ext cx="5400000" cy="518978"/>
+                      <a:ext cx="5760000" cy="1728000"/>
                     </a:xfrm>
                     <a:prstGeom prst="rect"/>
                   </pic:spPr>
@@ -181,7 +340,60 @@
           <w:b w:val="0"/>
           <w:i w:val="0"/>
         </w:rPr>
-        <w:t>Рисунок 1 – SQL-скрипт створення схеми library4</w:t>
+        <w:t>Рисунок 4 – Створення нової бази даних (Schema Editor)</w:t>
+      </w:r>
+    </w:p>
+    <w:p>
+      <w:pPr>
+        <w:spacing w:before="120"/>
+        <w:jc w:val="center"/>
+      </w:pPr>
+      <w:r>
+        <w:drawing>
+          <wp:inline xmlns:a="http://schemas.openxmlformats.org/drawingml/2006/main" xmlns:pic="http://schemas.openxmlformats.org/drawingml/2006/picture">
+            <wp:extent cx="4320000" cy="4160455"/>
+            <wp:docPr id="5" name="Picture 5"/>
+            <wp:cNvGraphicFramePr>
+              <a:graphicFrameLocks noChangeAspect="1"/>
+            </wp:cNvGraphicFramePr>
+            <a:graphic>
+              <a:graphicData uri="http://schemas.openxmlformats.org/drawingml/2006/picture">
+                <pic:pic>
+                  <pic:nvPicPr>
+                    <pic:cNvPr id="0" name="05_apply_script.png"/>
+                    <pic:cNvPicPr/>
+                  </pic:nvPicPr>
+                  <pic:blipFill>
+                    <a:blip r:embed="rId13"/>
+                    <a:stretch>
+                      <a:fillRect/>
+                    </a:stretch>
+                  </pic:blipFill>
+                  <pic:spPr>
+                    <a:xfrm>
+                      <a:off x="0" y="0"/>
+                      <a:ext cx="4320000" cy="4160455"/>
+                    </a:xfrm>
+                    <a:prstGeom prst="rect"/>
+                  </pic:spPr>
+                </pic:pic>
+              </a:graphicData>
+            </a:graphic>
+          </wp:inline>
+        </w:drawing>
+      </w:r>
+    </w:p>
+    <w:p>
+      <w:pPr>
+        <w:spacing w:after="160"/>
+        <w:jc w:val="center"/>
+      </w:pPr>
+      <w:r>
+        <w:rPr>
+          <w:b w:val="0"/>
+          <w:i w:val="0"/>
+        </w:rPr>
+        <w:t>Рисунок 5 – Вікно Apply SQL Script to Database зі скриптом CREATE SCHEMA</w:t>
       </w:r>
     </w:p>
     <w:p>
@@ -1383,8 +1595,8 @@
       <w:r>
         <w:drawing>
           <wp:inline xmlns:a="http://schemas.openxmlformats.org/drawingml/2006/main" xmlns:pic="http://schemas.openxmlformats.org/drawingml/2006/picture">
-            <wp:extent cx="4680000" cy="1352691"/>
-            <wp:docPr id="2" name="Picture 2"/>
+            <wp:extent cx="5760000" cy="2880000"/>
+            <wp:docPr id="6" name="Picture 6"/>
             <wp:cNvGraphicFramePr>
               <a:graphicFrameLocks noChangeAspect="1"/>
             </wp:cNvGraphicFramePr>
@@ -1392,11 +1604,11 @@
               <a:graphicData uri="http://schemas.openxmlformats.org/drawingml/2006/picture">
                 <pic:pic>
                   <pic:nvPicPr>
-                    <pic:cNvPr id="0" name="f02_author.png"/>
+                    <pic:cNvPr id="0" name="06_create_author.png"/>
                     <pic:cNvPicPr/>
                   </pic:nvPicPr>
                   <pic:blipFill>
-                    <a:blip r:embed="rId10"/>
+                    <a:blip r:embed="rId14"/>
                     <a:stretch>
                       <a:fillRect/>
                     </a:stretch>
@@ -1404,7 +1616,7 @@
                   <pic:spPr>
                     <a:xfrm>
                       <a:off x="0" y="0"/>
-                      <a:ext cx="4680000" cy="1352691"/>
+                      <a:ext cx="5760000" cy="2880000"/>
                     </a:xfrm>
                     <a:prstGeom prst="rect"/>
                   </pic:spPr>
@@ -1425,7 +1637,7 @@
           <w:b w:val="0"/>
           <w:i w:val="0"/>
         </w:rPr>
-        <w:t>Рисунок 2 – SQL-запит для створення таблиці Автор (author)</w:t>
+        <w:t>Рисунок 6 – SQL-запит для створення таблиці Автор (author)</w:t>
       </w:r>
     </w:p>
     <w:p>
@@ -1449,8 +1661,8 @@
       <w:r>
         <w:drawing>
           <wp:inline xmlns:a="http://schemas.openxmlformats.org/drawingml/2006/main" xmlns:pic="http://schemas.openxmlformats.org/drawingml/2006/picture">
-            <wp:extent cx="4680000" cy="1352691"/>
-            <wp:docPr id="3" name="Picture 3"/>
+            <wp:extent cx="5760000" cy="2880000"/>
+            <wp:docPr id="7" name="Picture 7"/>
             <wp:cNvGraphicFramePr>
               <a:graphicFrameLocks noChangeAspect="1"/>
             </wp:cNvGraphicFramePr>
@@ -1458,11 +1670,11 @@
               <a:graphicData uri="http://schemas.openxmlformats.org/drawingml/2006/picture">
                 <pic:pic>
                   <pic:nvPicPr>
-                    <pic:cNvPr id="0" name="f03_publisher.png"/>
+                    <pic:cNvPr id="0" name="06_create_publisher.png"/>
                     <pic:cNvPicPr/>
                   </pic:nvPicPr>
                   <pic:blipFill>
-                    <a:blip r:embed="rId11"/>
+                    <a:blip r:embed="rId15"/>
                     <a:stretch>
                       <a:fillRect/>
                     </a:stretch>
@@ -1470,7 +1682,7 @@
                   <pic:spPr>
                     <a:xfrm>
                       <a:off x="0" y="0"/>
-                      <a:ext cx="4680000" cy="1352691"/>
+                      <a:ext cx="5760000" cy="2880000"/>
                     </a:xfrm>
                     <a:prstGeom prst="rect"/>
                   </pic:spPr>
@@ -1491,7 +1703,7 @@
           <w:b w:val="0"/>
           <w:i w:val="0"/>
         </w:rPr>
-        <w:t>Рисунок 3 – Створення таблиці Видавництво (publisher)</w:t>
+        <w:t>Рисунок 7 – Створення таблиці Видавництво (publisher)</w:t>
       </w:r>
     </w:p>
     <w:p>
@@ -1515,8 +1727,8 @@
       <w:r>
         <w:drawing>
           <wp:inline xmlns:a="http://schemas.openxmlformats.org/drawingml/2006/main" xmlns:pic="http://schemas.openxmlformats.org/drawingml/2006/picture">
-            <wp:extent cx="4680000" cy="1204983"/>
-            <wp:docPr id="4" name="Picture 4"/>
+            <wp:extent cx="5760000" cy="2880000"/>
+            <wp:docPr id="8" name="Picture 8"/>
             <wp:cNvGraphicFramePr>
               <a:graphicFrameLocks noChangeAspect="1"/>
             </wp:cNvGraphicFramePr>
@@ -1524,11 +1736,11 @@
               <a:graphicData uri="http://schemas.openxmlformats.org/drawingml/2006/picture">
                 <pic:pic>
                   <pic:nvPicPr>
-                    <pic:cNvPr id="0" name="f04_bookstore.png"/>
+                    <pic:cNvPr id="0" name="06_create_bookstore.png"/>
                     <pic:cNvPicPr/>
                   </pic:nvPicPr>
                   <pic:blipFill>
-                    <a:blip r:embed="rId12"/>
+                    <a:blip r:embed="rId16"/>
                     <a:stretch>
                       <a:fillRect/>
                     </a:stretch>
@@ -1536,7 +1748,7 @@
                   <pic:spPr>
                     <a:xfrm>
                       <a:off x="0" y="0"/>
-                      <a:ext cx="4680000" cy="1204983"/>
+                      <a:ext cx="5760000" cy="2880000"/>
                     </a:xfrm>
                     <a:prstGeom prst="rect"/>
                   </pic:spPr>
@@ -1557,7 +1769,7 @@
           <w:b w:val="0"/>
           <w:i w:val="0"/>
         </w:rPr>
-        <w:t>Рисунок 4 – Створення таблиці Книготорговельна фірма (bookstore)</w:t>
+        <w:t>Рисунок 8 – Створення таблиці Книготорговельна фірма (bookstore)</w:t>
       </w:r>
     </w:p>
     <w:p>
@@ -1581,8 +1793,8 @@
       <w:r>
         <w:drawing>
           <wp:inline xmlns:a="http://schemas.openxmlformats.org/drawingml/2006/main" xmlns:pic="http://schemas.openxmlformats.org/drawingml/2006/picture">
-            <wp:extent cx="4680000" cy="2386645"/>
-            <wp:docPr id="5" name="Picture 5"/>
+            <wp:extent cx="5760000" cy="2880000"/>
+            <wp:docPr id="9" name="Picture 9"/>
             <wp:cNvGraphicFramePr>
               <a:graphicFrameLocks noChangeAspect="1"/>
             </wp:cNvGraphicFramePr>
@@ -1590,11 +1802,11 @@
               <a:graphicData uri="http://schemas.openxmlformats.org/drawingml/2006/picture">
                 <pic:pic>
                   <pic:nvPicPr>
-                    <pic:cNvPr id="0" name="f05_book.png"/>
+                    <pic:cNvPr id="0" name="06_create_book.png"/>
                     <pic:cNvPicPr/>
                   </pic:nvPicPr>
                   <pic:blipFill>
-                    <a:blip r:embed="rId13"/>
+                    <a:blip r:embed="rId17"/>
                     <a:stretch>
                       <a:fillRect/>
                     </a:stretch>
@@ -1602,7 +1814,7 @@
                   <pic:spPr>
                     <a:xfrm>
                       <a:off x="0" y="0"/>
-                      <a:ext cx="4680000" cy="2386645"/>
+                      <a:ext cx="5760000" cy="2880000"/>
                     </a:xfrm>
                     <a:prstGeom prst="rect"/>
                   </pic:spPr>
@@ -1623,7 +1835,7 @@
           <w:b w:val="0"/>
           <w:i w:val="0"/>
         </w:rPr>
-        <w:t>Рисунок 5 – Створення таблиці Книга (book)</w:t>
+        <w:t>Рисунок 9 – Створення таблиці Книга (book)</w:t>
       </w:r>
     </w:p>
     <w:p>
@@ -1636,7 +1848,113 @@
           <w:b w:val="0"/>
           <w:i w:val="0"/>
         </w:rPr>
-        <w:t>Після оновлення списку SCHEMAS у схемі library4 відображаються чотири таблиці: author, book, bookstore, publisher. Структуру кожної з них можна переглянути та змінити у вікні Alter Table (права кнопка миші на таблиці → Alter Table…).</w:t>
+        <w:t>Після оновлення списку SCHEMAS у схемі library4 відображаються чотири таблиці: author, book, bookstore, publisher. Структуру кожної з них можна переглянути та змінити у вікні Alter Table (права кнопка миші на таблиці → Alter Table…). На вкладці Foreign Keys видно три зовнішні ключі таблиці book.</w:t>
+      </w:r>
+    </w:p>
+    <w:p>
+      <w:pPr>
+        <w:spacing w:before="120"/>
+        <w:jc w:val="center"/>
+      </w:pPr>
+      <w:r>
+        <w:drawing>
+          <wp:inline xmlns:a="http://schemas.openxmlformats.org/drawingml/2006/main" xmlns:pic="http://schemas.openxmlformats.org/drawingml/2006/picture">
+            <wp:extent cx="5760000" cy="1860923"/>
+            <wp:docPr id="10" name="Picture 10"/>
+            <wp:cNvGraphicFramePr>
+              <a:graphicFrameLocks noChangeAspect="1"/>
+            </wp:cNvGraphicFramePr>
+            <a:graphic>
+              <a:graphicData uri="http://schemas.openxmlformats.org/drawingml/2006/picture">
+                <pic:pic>
+                  <pic:nvPicPr>
+                    <pic:cNvPr id="0" name="08_alter_book.png"/>
+                    <pic:cNvPicPr/>
+                  </pic:nvPicPr>
+                  <pic:blipFill>
+                    <a:blip r:embed="rId18"/>
+                    <a:stretch>
+                      <a:fillRect/>
+                    </a:stretch>
+                  </pic:blipFill>
+                  <pic:spPr>
+                    <a:xfrm>
+                      <a:off x="0" y="0"/>
+                      <a:ext cx="5760000" cy="1860923"/>
+                    </a:xfrm>
+                    <a:prstGeom prst="rect"/>
+                  </pic:spPr>
+                </pic:pic>
+              </a:graphicData>
+            </a:graphic>
+          </wp:inline>
+        </w:drawing>
+      </w:r>
+    </w:p>
+    <w:p>
+      <w:pPr>
+        <w:spacing w:after="160"/>
+        <w:jc w:val="center"/>
+      </w:pPr>
+      <w:r>
+        <w:rPr>
+          <w:b w:val="0"/>
+          <w:i w:val="0"/>
+        </w:rPr>
+        <w:t>Рисунок 10 – Вікно Alter Table для таблиці book</w:t>
+      </w:r>
+    </w:p>
+    <w:p>
+      <w:pPr>
+        <w:spacing w:before="120"/>
+        <w:jc w:val="center"/>
+      </w:pPr>
+      <w:r>
+        <w:drawing>
+          <wp:inline xmlns:a="http://schemas.openxmlformats.org/drawingml/2006/main" xmlns:pic="http://schemas.openxmlformats.org/drawingml/2006/picture">
+            <wp:extent cx="5760000" cy="1584000"/>
+            <wp:docPr id="11" name="Picture 11"/>
+            <wp:cNvGraphicFramePr>
+              <a:graphicFrameLocks noChangeAspect="1"/>
+            </wp:cNvGraphicFramePr>
+            <a:graphic>
+              <a:graphicData uri="http://schemas.openxmlformats.org/drawingml/2006/picture">
+                <pic:pic>
+                  <pic:nvPicPr>
+                    <pic:cNvPr id="0" name="09_foreign_keys.png"/>
+                    <pic:cNvPicPr/>
+                  </pic:nvPicPr>
+                  <pic:blipFill>
+                    <a:blip r:embed="rId19"/>
+                    <a:stretch>
+                      <a:fillRect/>
+                    </a:stretch>
+                  </pic:blipFill>
+                  <pic:spPr>
+                    <a:xfrm>
+                      <a:off x="0" y="0"/>
+                      <a:ext cx="5760000" cy="1584000"/>
+                    </a:xfrm>
+                    <a:prstGeom prst="rect"/>
+                  </pic:spPr>
+                </pic:pic>
+              </a:graphicData>
+            </a:graphic>
+          </wp:inline>
+        </w:drawing>
+      </w:r>
+    </w:p>
+    <w:p>
+      <w:pPr>
+        <w:spacing w:after="160"/>
+        <w:jc w:val="center"/>
+      </w:pPr>
+      <w:r>
+        <w:rPr>
+          <w:b w:val="0"/>
+          <w:i w:val="0"/>
+        </w:rPr>
+        <w:t>Рисунок 11 – Зовнішні ключі таблиці book (вкладка Foreign Keys)</w:t>
       </w:r>
     </w:p>
     <w:p>
@@ -1657,7 +1975,7 @@
         <w:t>Заповнення таблиць даними.</w:t>
       </w:r>
       <w:r>
-        <w:t xml:space="preserve"> Таблиці заповнено тими самими даними про книги, що й у практикумі №1 (п’ять книг: «Кобзар», «Лісова пісня», «Тигролови», «Місто», «Захар Беркут»). Для полів-кодів передається NULL – значення генерується автоматично завдяки AUTO_INCREMENT. Результат перевірено командою Select Rows (права кнопка миші на таблиці → Select Rows).</w:t>
+        <w:t xml:space="preserve"> Таблиці заповнено тими самими даними про книги, що й у практикумі №1 (п’ять книг: «Кобзар», «Лісова пісня», «Тигролови», «Місто», «Захар Беркут»). Для полів-кодів передається NULL – значення генерується автоматично завдяки AUTO_INCREMENT. Після кожного INSERT виконано SELECT * FROM … – результат відображається в Result Grid.</w:t>
       </w:r>
     </w:p>
     <w:p>
@@ -1668,8 +1986,8 @@
       <w:r>
         <w:drawing>
           <wp:inline xmlns:a="http://schemas.openxmlformats.org/drawingml/2006/main" xmlns:pic="http://schemas.openxmlformats.org/drawingml/2006/picture">
-            <wp:extent cx="5760000" cy="2235033"/>
-            <wp:docPr id="6" name="Picture 6"/>
+            <wp:extent cx="5760000" cy="3514576"/>
+            <wp:docPr id="12" name="Picture 12"/>
             <wp:cNvGraphicFramePr>
               <a:graphicFrameLocks noChangeAspect="1"/>
             </wp:cNvGraphicFramePr>
@@ -1677,11 +1995,11 @@
               <a:graphicData uri="http://schemas.openxmlformats.org/drawingml/2006/picture">
                 <pic:pic>
                   <pic:nvPicPr>
-                    <pic:cNvPr id="0" name="f06_ins_author.png"/>
+                    <pic:cNvPr id="0" name="07_insert_author.png"/>
                     <pic:cNvPicPr/>
                   </pic:nvPicPr>
                   <pic:blipFill>
-                    <a:blip r:embed="rId14"/>
+                    <a:blip r:embed="rId20"/>
                     <a:stretch>
                       <a:fillRect/>
                     </a:stretch>
@@ -1689,7 +2007,7 @@
                   <pic:spPr>
                     <a:xfrm>
                       <a:off x="0" y="0"/>
-                      <a:ext cx="5760000" cy="2235033"/>
+                      <a:ext cx="5760000" cy="3514576"/>
                     </a:xfrm>
                     <a:prstGeom prst="rect"/>
                   </pic:spPr>
@@ -1710,7 +2028,7 @@
           <w:b w:val="0"/>
           <w:i w:val="0"/>
         </w:rPr>
-        <w:t>Рисунок 6 – Заповнення та перегляд таблиці Автор (author)</w:t>
+        <w:t>Рисунок 12 – Заповнення та перегляд таблиці Автор (author)</w:t>
       </w:r>
     </w:p>
     <w:p>
@@ -1721,8 +2039,8 @@
       <w:r>
         <w:drawing>
           <wp:inline xmlns:a="http://schemas.openxmlformats.org/drawingml/2006/main" xmlns:pic="http://schemas.openxmlformats.org/drawingml/2006/picture">
-            <wp:extent cx="5760000" cy="1711397"/>
-            <wp:docPr id="7" name="Picture 7"/>
+            <wp:extent cx="5760000" cy="3514576"/>
+            <wp:docPr id="13" name="Picture 13"/>
             <wp:cNvGraphicFramePr>
               <a:graphicFrameLocks noChangeAspect="1"/>
             </wp:cNvGraphicFramePr>
@@ -1730,11 +2048,11 @@
               <a:graphicData uri="http://schemas.openxmlformats.org/drawingml/2006/picture">
                 <pic:pic>
                   <pic:nvPicPr>
-                    <pic:cNvPr id="0" name="f07_ins_publisher.png"/>
+                    <pic:cNvPr id="0" name="07_insert_publisher.png"/>
                     <pic:cNvPicPr/>
                   </pic:nvPicPr>
                   <pic:blipFill>
-                    <a:blip r:embed="rId15"/>
+                    <a:blip r:embed="rId21"/>
                     <a:stretch>
                       <a:fillRect/>
                     </a:stretch>
@@ -1742,7 +2060,7 @@
                   <pic:spPr>
                     <a:xfrm>
                       <a:off x="0" y="0"/>
-                      <a:ext cx="5760000" cy="1711397"/>
+                      <a:ext cx="5760000" cy="3514576"/>
                     </a:xfrm>
                     <a:prstGeom prst="rect"/>
                   </pic:spPr>
@@ -1763,7 +2081,7 @@
           <w:b w:val="0"/>
           <w:i w:val="0"/>
         </w:rPr>
-        <w:t>Рисунок 7 – Заповнення та перегляд таблиці Видавництво (publisher)</w:t>
+        <w:t>Рисунок 13 – Заповнення та перегляд таблиці Видавництво (publisher)</w:t>
       </w:r>
     </w:p>
     <w:p>
@@ -1774,8 +2092,8 @@
       <w:r>
         <w:drawing>
           <wp:inline xmlns:a="http://schemas.openxmlformats.org/drawingml/2006/main" xmlns:pic="http://schemas.openxmlformats.org/drawingml/2006/picture">
-            <wp:extent cx="5760000" cy="1973215"/>
-            <wp:docPr id="8" name="Picture 8"/>
+            <wp:extent cx="5760000" cy="3514576"/>
+            <wp:docPr id="14" name="Picture 14"/>
             <wp:cNvGraphicFramePr>
               <a:graphicFrameLocks noChangeAspect="1"/>
             </wp:cNvGraphicFramePr>
@@ -1783,11 +2101,11 @@
               <a:graphicData uri="http://schemas.openxmlformats.org/drawingml/2006/picture">
                 <pic:pic>
                   <pic:nvPicPr>
-                    <pic:cNvPr id="0" name="f08_ins_bookstore.png"/>
+                    <pic:cNvPr id="0" name="07_insert_bookstore.png"/>
                     <pic:cNvPicPr/>
                   </pic:nvPicPr>
                   <pic:blipFill>
-                    <a:blip r:embed="rId16"/>
+                    <a:blip r:embed="rId22"/>
                     <a:stretch>
                       <a:fillRect/>
                     </a:stretch>
@@ -1795,7 +2113,7 @@
                   <pic:spPr>
                     <a:xfrm>
                       <a:off x="0" y="0"/>
-                      <a:ext cx="5760000" cy="1973215"/>
+                      <a:ext cx="5760000" cy="3514576"/>
                     </a:xfrm>
                     <a:prstGeom prst="rect"/>
                   </pic:spPr>
@@ -1816,7 +2134,7 @@
           <w:b w:val="0"/>
           <w:i w:val="0"/>
         </w:rPr>
-        <w:t>Рисунок 8 – Заповнення та перегляд таблиці Книготорговельна фірма (bookstore)</w:t>
+        <w:t>Рисунок 14 – Заповнення та перегляд таблиці Книготорговельна фірма (bookstore)</w:t>
       </w:r>
     </w:p>
     <w:p>
@@ -1840,8 +2158,8 @@
       <w:r>
         <w:drawing>
           <wp:inline xmlns:a="http://schemas.openxmlformats.org/drawingml/2006/main" xmlns:pic="http://schemas.openxmlformats.org/drawingml/2006/picture">
-            <wp:extent cx="5760000" cy="2599024"/>
-            <wp:docPr id="9" name="Picture 9"/>
+            <wp:extent cx="5760000" cy="3514576"/>
+            <wp:docPr id="15" name="Picture 15"/>
             <wp:cNvGraphicFramePr>
               <a:graphicFrameLocks noChangeAspect="1"/>
             </wp:cNvGraphicFramePr>
@@ -1849,11 +2167,11 @@
               <a:graphicData uri="http://schemas.openxmlformats.org/drawingml/2006/picture">
                 <pic:pic>
                   <pic:nvPicPr>
-                    <pic:cNvPr id="0" name="f09_ins_book.png"/>
+                    <pic:cNvPr id="0" name="07_insert_book.png"/>
                     <pic:cNvPicPr/>
                   </pic:nvPicPr>
                   <pic:blipFill>
-                    <a:blip r:embed="rId17"/>
+                    <a:blip r:embed="rId23"/>
                     <a:stretch>
                       <a:fillRect/>
                     </a:stretch>
@@ -1861,7 +2179,7 @@
                   <pic:spPr>
                     <a:xfrm>
                       <a:off x="0" y="0"/>
-                      <a:ext cx="5760000" cy="2599024"/>
+                      <a:ext cx="5760000" cy="3514576"/>
                     </a:xfrm>
                     <a:prstGeom prst="rect"/>
                   </pic:spPr>
@@ -1882,7 +2200,7 @@
           <w:b w:val="0"/>
           <w:i w:val="0"/>
         </w:rPr>
-        <w:t>Рисунок 9 – Заповнення та перегляд таблиці Книга (book)</w:t>
+        <w:t>Рисунок 15 – Заповнення та перегляд таблиці Книга (book)</w:t>
       </w:r>
     </w:p>
     <w:p>
@@ -1903,7 +2221,7 @@
         <w:t>Діаграма бази даних.</w:t>
       </w:r>
       <w:r>
-        <w:t xml:space="preserve"> Для наочного представлення структури побудовано EER-діаграму (Database → Reverse Engineer… → схема library4). На діаграмі видно, що кожна з таблиць author, publisher та bookstore пов’язана з таблицею book зв’язком «один до багатьох»: один автор, видавництво чи фірма може відповідати кільком книгам.</w:t>
+        <w:t xml:space="preserve"> Для наочного представлення структури побудовано EER-діаграму (Database → Reverse Engineer… → з’єднання library → схема library4). На діаграмі видно, що кожна з таблиць author, publisher та bookstore пов’язана з таблицею book зв’язком «один до багатьох»: один автор, видавництво чи фірма може відповідати кільком книгам.</w:t>
       </w:r>
     </w:p>
     <w:p>
@@ -1914,8 +2232,8 @@
       <w:r>
         <w:drawing>
           <wp:inline xmlns:a="http://schemas.openxmlformats.org/drawingml/2006/main" xmlns:pic="http://schemas.openxmlformats.org/drawingml/2006/picture">
-            <wp:extent cx="5400000" cy="2956845"/>
-            <wp:docPr id="10" name="Picture 10"/>
+            <wp:extent cx="5400000" cy="2835000"/>
+            <wp:docPr id="16" name="Picture 16"/>
             <wp:cNvGraphicFramePr>
               <a:graphicFrameLocks noChangeAspect="1"/>
             </wp:cNvGraphicFramePr>
@@ -1923,11 +2241,11 @@
               <a:graphicData uri="http://schemas.openxmlformats.org/drawingml/2006/picture">
                 <pic:pic>
                   <pic:nvPicPr>
-                    <pic:cNvPr id="0" name="er.png"/>
+                    <pic:cNvPr id="0" name="10_eer.png"/>
                     <pic:cNvPicPr/>
                   </pic:nvPicPr>
                   <pic:blipFill>
-                    <a:blip r:embed="rId18"/>
+                    <a:blip r:embed="rId24"/>
                     <a:stretch>
                       <a:fillRect/>
                     </a:stretch>
@@ -1935,7 +2253,7 @@
                   <pic:spPr>
                     <a:xfrm>
                       <a:off x="0" y="0"/>
-                      <a:ext cx="5400000" cy="2956845"/>
+                      <a:ext cx="5400000" cy="2835000"/>
                     </a:xfrm>
                     <a:prstGeom prst="rect"/>
                   </pic:spPr>
@@ -1956,7 +2274,7 @@
           <w:b w:val="0"/>
           <w:i w:val="0"/>
         </w:rPr>
-        <w:t>Рисунок 10 – Діаграма зв’язків таблиць бази даних library4</w:t>
+        <w:t>Рисунок 16 – EER-діаграма бази даних library4</w:t>
       </w:r>
     </w:p>
     <w:p>
@@ -2001,8 +2319,8 @@
       <w:r>
         <w:drawing>
           <wp:inline xmlns:a="http://schemas.openxmlformats.org/drawingml/2006/main" xmlns:pic="http://schemas.openxmlformats.org/drawingml/2006/picture">
-            <wp:extent cx="5760000" cy="1187761"/>
-            <wp:docPr id="11" name="Picture 11"/>
+            <wp:extent cx="5760000" cy="3514576"/>
+            <wp:docPr id="17" name="Picture 17"/>
             <wp:cNvGraphicFramePr>
               <a:graphicFrameLocks noChangeAspect="1"/>
             </wp:cNvGraphicFramePr>
@@ -2010,11 +2328,11 @@
               <a:graphicData uri="http://schemas.openxmlformats.org/drawingml/2006/picture">
                 <pic:pic>
                   <pic:nvPicPr>
-                    <pic:cNvPr id="0" name="q2.png"/>
+                    <pic:cNvPr id="0" name="11_q2.png"/>
                     <pic:cNvPicPr/>
                   </pic:nvPicPr>
                   <pic:blipFill>
-                    <a:blip r:embed="rId19"/>
+                    <a:blip r:embed="rId25"/>
                     <a:stretch>
                       <a:fillRect/>
                     </a:stretch>
@@ -2022,7 +2340,7 @@
                   <pic:spPr>
                     <a:xfrm>
                       <a:off x="0" y="0"/>
-                      <a:ext cx="5760000" cy="1187761"/>
+                      <a:ext cx="5760000" cy="3514576"/>
                     </a:xfrm>
                     <a:prstGeom prst="rect"/>
                   </pic:spPr>
@@ -2043,7 +2361,7 @@
           <w:b w:val="0"/>
           <w:i w:val="0"/>
         </w:rPr>
-        <w:t>Рисунок 11 – Вибірка книги з назвою «Кобзар»</w:t>
+        <w:t>Рисунок 17 – Вибірка книги з назвою «Кобзар»</w:t>
       </w:r>
     </w:p>
     <w:p>
@@ -2067,8 +2385,8 @@
       <w:r>
         <w:drawing>
           <wp:inline xmlns:a="http://schemas.openxmlformats.org/drawingml/2006/main" xmlns:pic="http://schemas.openxmlformats.org/drawingml/2006/picture">
-            <wp:extent cx="5760000" cy="1071506"/>
-            <wp:docPr id="12" name="Picture 12"/>
+            <wp:extent cx="5760000" cy="3514576"/>
+            <wp:docPr id="18" name="Picture 18"/>
             <wp:cNvGraphicFramePr>
               <a:graphicFrameLocks noChangeAspect="1"/>
             </wp:cNvGraphicFramePr>
@@ -2076,11 +2394,11 @@
               <a:graphicData uri="http://schemas.openxmlformats.org/drawingml/2006/picture">
                 <pic:pic>
                   <pic:nvPicPr>
-                    <pic:cNvPr id="0" name="q3.png"/>
+                    <pic:cNvPr id="0" name="11_q3.png"/>
                     <pic:cNvPicPr/>
                   </pic:nvPicPr>
                   <pic:blipFill>
-                    <a:blip r:embed="rId20"/>
+                    <a:blip r:embed="rId26"/>
                     <a:stretch>
                       <a:fillRect/>
                     </a:stretch>
@@ -2088,7 +2406,7 @@
                   <pic:spPr>
                     <a:xfrm>
                       <a:off x="0" y="0"/>
-                      <a:ext cx="5760000" cy="1071506"/>
+                      <a:ext cx="5760000" cy="3514576"/>
                     </a:xfrm>
                     <a:prstGeom prst="rect"/>
                   </pic:spPr>
@@ -2109,7 +2427,7 @@
           <w:b w:val="0"/>
           <w:i w:val="0"/>
         </w:rPr>
-        <w:t>Рисунок 12 – Вибірка книги «Кобзар» з двох таблиць (book, author)</w:t>
+        <w:t>Рисунок 18 – Вибірка книги «Кобзар» з двох таблиць (book, author)</w:t>
       </w:r>
     </w:p>
     <w:p>
@@ -2175,8 +2493,8 @@
       <w:r>
         <w:drawing>
           <wp:inline xmlns:a="http://schemas.openxmlformats.org/drawingml/2006/main" xmlns:pic="http://schemas.openxmlformats.org/drawingml/2006/picture">
-            <wp:extent cx="5760000" cy="1301488"/>
-            <wp:docPr id="13" name="Picture 13"/>
+            <wp:extent cx="5760000" cy="3514576"/>
+            <wp:docPr id="19" name="Picture 19"/>
             <wp:cNvGraphicFramePr>
               <a:graphicFrameLocks noChangeAspect="1"/>
             </wp:cNvGraphicFramePr>
@@ -2184,11 +2502,11 @@
               <a:graphicData uri="http://schemas.openxmlformats.org/drawingml/2006/picture">
                 <pic:pic>
                   <pic:nvPicPr>
-                    <pic:cNvPr id="0" name="q4.png"/>
+                    <pic:cNvPr id="0" name="11_q4.png"/>
                     <pic:cNvPicPr/>
                   </pic:nvPicPr>
                   <pic:blipFill>
-                    <a:blip r:embed="rId21"/>
+                    <a:blip r:embed="rId27"/>
                     <a:stretch>
                       <a:fillRect/>
                     </a:stretch>
@@ -2196,7 +2514,7 @@
                   <pic:spPr>
                     <a:xfrm>
                       <a:off x="0" y="0"/>
-                      <a:ext cx="5760000" cy="1301488"/>
+                      <a:ext cx="5760000" cy="3514576"/>
                     </a:xfrm>
                     <a:prstGeom prst="rect"/>
                   </pic:spPr>
@@ -2217,7 +2535,7 @@
           <w:b w:val="0"/>
           <w:i w:val="0"/>
         </w:rPr>
-        <w:t>Рисунок 13 – Книги, видані після 1900 року, з даними про автора</w:t>
+        <w:t>Рисунок 19 – Книги, видані після 1900 року, з даними про автора</w:t>
       </w:r>
     </w:p>
     <w:p>
@@ -2241,8 +2559,8 @@
       <w:r>
         <w:drawing>
           <wp:inline xmlns:a="http://schemas.openxmlformats.org/drawingml/2006/main" xmlns:pic="http://schemas.openxmlformats.org/drawingml/2006/picture">
-            <wp:extent cx="5760000" cy="1449579"/>
-            <wp:docPr id="14" name="Picture 14"/>
+            <wp:extent cx="5760000" cy="3514576"/>
+            <wp:docPr id="20" name="Picture 20"/>
             <wp:cNvGraphicFramePr>
               <a:graphicFrameLocks noChangeAspect="1"/>
             </wp:cNvGraphicFramePr>
@@ -2250,11 +2568,11 @@
               <a:graphicData uri="http://schemas.openxmlformats.org/drawingml/2006/picture">
                 <pic:pic>
                   <pic:nvPicPr>
-                    <pic:cNvPr id="0" name="q5.png"/>
+                    <pic:cNvPr id="0" name="11_q5.png"/>
                     <pic:cNvPicPr/>
                   </pic:nvPicPr>
                   <pic:blipFill>
-                    <a:blip r:embed="rId22"/>
+                    <a:blip r:embed="rId28"/>
                     <a:stretch>
                       <a:fillRect/>
                     </a:stretch>
@@ -2262,7 +2580,7 @@
                   <pic:spPr>
                     <a:xfrm>
                       <a:off x="0" y="0"/>
-                      <a:ext cx="5760000" cy="1449579"/>
+                      <a:ext cx="5760000" cy="3514576"/>
                     </a:xfrm>
                     <a:prstGeom prst="rect"/>
                   </pic:spPr>
@@ -2283,7 +2601,7 @@
           <w:b w:val="0"/>
           <w:i w:val="0"/>
         </w:rPr>
-        <w:t>Рисунок 14 – Використання реляційних та булевих операторів (&gt;=, AND, NOT)</w:t>
+        <w:t>Рисунок 20 – Використання реляційних та булевих операторів (&gt;=, AND, NOT)</w:t>
       </w:r>
     </w:p>
     <w:p>
@@ -2315,8 +2633,8 @@
       <w:r>
         <w:drawing>
           <wp:inline xmlns:a="http://schemas.openxmlformats.org/drawingml/2006/main" xmlns:pic="http://schemas.openxmlformats.org/drawingml/2006/picture">
-            <wp:extent cx="5760000" cy="1590067"/>
-            <wp:docPr id="15" name="Picture 15"/>
+            <wp:extent cx="5760000" cy="3514576"/>
+            <wp:docPr id="21" name="Picture 21"/>
             <wp:cNvGraphicFramePr>
               <a:graphicFrameLocks noChangeAspect="1"/>
             </wp:cNvGraphicFramePr>
@@ -2324,11 +2642,11 @@
               <a:graphicData uri="http://schemas.openxmlformats.org/drawingml/2006/picture">
                 <pic:pic>
                   <pic:nvPicPr>
-                    <pic:cNvPr id="0" name="q6.png"/>
+                    <pic:cNvPr id="0" name="11_q6.png"/>
                     <pic:cNvPicPr/>
                   </pic:nvPicPr>
                   <pic:blipFill>
-                    <a:blip r:embed="rId23"/>
+                    <a:blip r:embed="rId29"/>
                     <a:stretch>
                       <a:fillRect/>
                     </a:stretch>
@@ -2336,7 +2654,7 @@
                   <pic:spPr>
                     <a:xfrm>
                       <a:off x="0" y="0"/>
-                      <a:ext cx="5760000" cy="1590067"/>
+                      <a:ext cx="5760000" cy="3514576"/>
                     </a:xfrm>
                     <a:prstGeom prst="rect"/>
                   </pic:spPr>
@@ -2357,7 +2675,7 @@
           <w:b w:val="0"/>
           <w:i w:val="0"/>
         </w:rPr>
-        <w:t>Рисунок 15 – Вибірка книг з використанням оператора OR</w:t>
+        <w:t>Рисунок 21 – Вибірка книг з використанням оператора OR</w:t>
       </w:r>
     </w:p>
     <w:p>
@@ -2381,8 +2699,8 @@
       <w:r>
         <w:drawing>
           <wp:inline xmlns:a="http://schemas.openxmlformats.org/drawingml/2006/main" xmlns:pic="http://schemas.openxmlformats.org/drawingml/2006/picture">
-            <wp:extent cx="5760000" cy="1590067"/>
-            <wp:docPr id="16" name="Picture 16"/>
+            <wp:extent cx="5760000" cy="3514576"/>
+            <wp:docPr id="22" name="Picture 22"/>
             <wp:cNvGraphicFramePr>
               <a:graphicFrameLocks noChangeAspect="1"/>
             </wp:cNvGraphicFramePr>
@@ -2390,11 +2708,11 @@
               <a:graphicData uri="http://schemas.openxmlformats.org/drawingml/2006/picture">
                 <pic:pic>
                   <pic:nvPicPr>
-                    <pic:cNvPr id="0" name="q7.png"/>
+                    <pic:cNvPr id="0" name="11_q7.png"/>
                     <pic:cNvPicPr/>
                   </pic:nvPicPr>
                   <pic:blipFill>
-                    <a:blip r:embed="rId24"/>
+                    <a:blip r:embed="rId30"/>
                     <a:stretch>
                       <a:fillRect/>
                     </a:stretch>
@@ -2402,7 +2720,7 @@
                   <pic:spPr>
                     <a:xfrm>
                       <a:off x="0" y="0"/>
-                      <a:ext cx="5760000" cy="1590067"/>
+                      <a:ext cx="5760000" cy="3514576"/>
                     </a:xfrm>
                     <a:prstGeom prst="rect"/>
                   </pic:spPr>
@@ -2423,7 +2741,7 @@
           <w:b w:val="0"/>
           <w:i w:val="0"/>
         </w:rPr>
-        <w:t>Рисунок 16 – Вибірка книг з використанням оператора IN</w:t>
+        <w:t>Рисунок 22 – Вибірка книг з використанням оператора IN</w:t>
       </w:r>
     </w:p>
     <w:p>
@@ -2455,8 +2773,8 @@
       <w:r>
         <w:drawing>
           <wp:inline xmlns:a="http://schemas.openxmlformats.org/drawingml/2006/main" xmlns:pic="http://schemas.openxmlformats.org/drawingml/2006/picture">
-            <wp:extent cx="5760000" cy="1749712"/>
-            <wp:docPr id="17" name="Picture 17"/>
+            <wp:extent cx="5760000" cy="3514576"/>
+            <wp:docPr id="23" name="Picture 23"/>
             <wp:cNvGraphicFramePr>
               <a:graphicFrameLocks noChangeAspect="1"/>
             </wp:cNvGraphicFramePr>
@@ -2464,11 +2782,11 @@
               <a:graphicData uri="http://schemas.openxmlformats.org/drawingml/2006/picture">
                 <pic:pic>
                   <pic:nvPicPr>
-                    <pic:cNvPr id="0" name="q8.png"/>
+                    <pic:cNvPr id="0" name="11_q8.png"/>
                     <pic:cNvPicPr/>
                   </pic:nvPicPr>
                   <pic:blipFill>
-                    <a:blip r:embed="rId25"/>
+                    <a:blip r:embed="rId31"/>
                     <a:stretch>
                       <a:fillRect/>
                     </a:stretch>
@@ -2476,7 +2794,7 @@
                   <pic:spPr>
                     <a:xfrm>
                       <a:off x="0" y="0"/>
-                      <a:ext cx="5760000" cy="1749712"/>
+                      <a:ext cx="5760000" cy="3514576"/>
                     </a:xfrm>
                     <a:prstGeom prst="rect"/>
                   </pic:spPr>
@@ -2497,7 +2815,7 @@
           <w:b w:val="0"/>
           <w:i w:val="0"/>
         </w:rPr>
-        <w:t>Рисунок 17 – Сортування книг за зростанням ціни (ORDER BY … ASC)</w:t>
+        <w:t>Рисунок 23 – Сортування книг за зростанням ціни (ORDER BY … ASC)</w:t>
       </w:r>
     </w:p>
     <w:p>
@@ -2521,8 +2839,8 @@
       <w:r>
         <w:drawing>
           <wp:inline xmlns:a="http://schemas.openxmlformats.org/drawingml/2006/main" xmlns:pic="http://schemas.openxmlformats.org/drawingml/2006/picture">
-            <wp:extent cx="5760000" cy="1749712"/>
-            <wp:docPr id="18" name="Picture 18"/>
+            <wp:extent cx="5760000" cy="3514576"/>
+            <wp:docPr id="24" name="Picture 24"/>
             <wp:cNvGraphicFramePr>
               <a:graphicFrameLocks noChangeAspect="1"/>
             </wp:cNvGraphicFramePr>
@@ -2530,11 +2848,11 @@
               <a:graphicData uri="http://schemas.openxmlformats.org/drawingml/2006/picture">
                 <pic:pic>
                   <pic:nvPicPr>
-                    <pic:cNvPr id="0" name="q9.png"/>
+                    <pic:cNvPr id="0" name="11_q9.png"/>
                     <pic:cNvPicPr/>
                   </pic:nvPicPr>
                   <pic:blipFill>
-                    <a:blip r:embed="rId26"/>
+                    <a:blip r:embed="rId32"/>
                     <a:stretch>
                       <a:fillRect/>
                     </a:stretch>
@@ -2542,7 +2860,7 @@
                   <pic:spPr>
                     <a:xfrm>
                       <a:off x="0" y="0"/>
-                      <a:ext cx="5760000" cy="1749712"/>
+                      <a:ext cx="5760000" cy="3514576"/>
                     </a:xfrm>
                     <a:prstGeom prst="rect"/>
                   </pic:spPr>
@@ -2563,7 +2881,7 @@
           <w:b w:val="0"/>
           <w:i w:val="0"/>
         </w:rPr>
-        <w:t>Рисунок 18 – Сортування книг за спаданням року видання (ORDER BY … DESC)</w:t>
+        <w:t>Рисунок 24 – Сортування книг за спаданням року видання (ORDER BY … DESC)</w:t>
       </w:r>
     </w:p>
     <w:p>
@@ -2612,8 +2930,8 @@
       <w:r>
         <w:drawing>
           <wp:inline xmlns:a="http://schemas.openxmlformats.org/drawingml/2006/main" xmlns:pic="http://schemas.openxmlformats.org/drawingml/2006/picture">
-            <wp:extent cx="5760000" cy="1430421"/>
-            <wp:docPr id="19" name="Picture 19"/>
+            <wp:extent cx="5760000" cy="3514576"/>
+            <wp:docPr id="25" name="Picture 25"/>
             <wp:cNvGraphicFramePr>
               <a:graphicFrameLocks noChangeAspect="1"/>
             </wp:cNvGraphicFramePr>
@@ -2621,11 +2939,11 @@
               <a:graphicData uri="http://schemas.openxmlformats.org/drawingml/2006/picture">
                 <pic:pic>
                   <pic:nvPicPr>
-                    <pic:cNvPr id="0" name="s1.png"/>
+                    <pic:cNvPr id="0" name="11_s1.png"/>
                     <pic:cNvPicPr/>
                   </pic:nvPicPr>
                   <pic:blipFill>
-                    <a:blip r:embed="rId27"/>
+                    <a:blip r:embed="rId33"/>
                     <a:stretch>
                       <a:fillRect/>
                     </a:stretch>
@@ -2633,7 +2951,7 @@
                   <pic:spPr>
                     <a:xfrm>
                       <a:off x="0" y="0"/>
-                      <a:ext cx="5760000" cy="1430421"/>
+                      <a:ext cx="5760000" cy="3514576"/>
                     </a:xfrm>
                     <a:prstGeom prst="rect"/>
                   </pic:spPr>
@@ -2654,7 +2972,7 @@
           <w:b w:val="0"/>
           <w:i w:val="0"/>
         </w:rPr>
-        <w:t>Рисунок 19 – Самостійне завдання 1 – книга з ціною 350, її автор та країна видавництва</w:t>
+        <w:t>Рисунок 25 – Самостійне завдання 1 – книга з ціною 350, її автор та країна видавництва</w:t>
       </w:r>
     </w:p>
     <w:p>
@@ -2678,8 +2996,8 @@
       <w:r>
         <w:drawing>
           <wp:inline xmlns:a="http://schemas.openxmlformats.org/drawingml/2006/main" xmlns:pic="http://schemas.openxmlformats.org/drawingml/2006/picture">
-            <wp:extent cx="5760000" cy="1449579"/>
-            <wp:docPr id="20" name="Picture 20"/>
+            <wp:extent cx="5760000" cy="3514576"/>
+            <wp:docPr id="26" name="Picture 26"/>
             <wp:cNvGraphicFramePr>
               <a:graphicFrameLocks noChangeAspect="1"/>
             </wp:cNvGraphicFramePr>
@@ -2687,11 +3005,11 @@
               <a:graphicData uri="http://schemas.openxmlformats.org/drawingml/2006/picture">
                 <pic:pic>
                   <pic:nvPicPr>
-                    <pic:cNvPr id="0" name="s2.png"/>
+                    <pic:cNvPr id="0" name="11_s2.png"/>
                     <pic:cNvPicPr/>
                   </pic:nvPicPr>
                   <pic:blipFill>
-                    <a:blip r:embed="rId28"/>
+                    <a:blip r:embed="rId34"/>
                     <a:stretch>
                       <a:fillRect/>
                     </a:stretch>
@@ -2699,7 +3017,7 @@
                   <pic:spPr>
                     <a:xfrm>
                       <a:off x="0" y="0"/>
-                      <a:ext cx="5760000" cy="1449579"/>
+                      <a:ext cx="5760000" cy="3514576"/>
                     </a:xfrm>
                     <a:prstGeom prst="rect"/>
                   </pic:spPr>
@@ -2720,7 +3038,7 @@
           <w:b w:val="0"/>
           <w:i w:val="0"/>
         </w:rPr>
-        <w:t>Рисунок 20 – Самостійне завдання 2 – книги, видані у м. Харків</w:t>
+        <w:t>Рисунок 26 – Самостійне завдання 2 – книги, видані у м. Харків</w:t>
       </w:r>
     </w:p>
     <w:p>
@@ -2744,8 +3062,8 @@
       <w:r>
         <w:drawing>
           <wp:inline xmlns:a="http://schemas.openxmlformats.org/drawingml/2006/main" xmlns:pic="http://schemas.openxmlformats.org/drawingml/2006/picture">
-            <wp:extent cx="5940000" cy="2091397"/>
-            <wp:docPr id="21" name="Picture 21"/>
+            <wp:extent cx="5760000" cy="3514576"/>
+            <wp:docPr id="27" name="Picture 27"/>
             <wp:cNvGraphicFramePr>
               <a:graphicFrameLocks noChangeAspect="1"/>
             </wp:cNvGraphicFramePr>
@@ -2753,11 +3071,11 @@
               <a:graphicData uri="http://schemas.openxmlformats.org/drawingml/2006/picture">
                 <pic:pic>
                   <pic:nvPicPr>
-                    <pic:cNvPr id="0" name="fin.png"/>
+                    <pic:cNvPr id="0" name="11_fin.png"/>
                     <pic:cNvPicPr/>
                   </pic:nvPicPr>
                   <pic:blipFill>
-                    <a:blip r:embed="rId29"/>
+                    <a:blip r:embed="rId35"/>
                     <a:stretch>
                       <a:fillRect/>
                     </a:stretch>
@@ -2765,7 +3083,7 @@
                   <pic:spPr>
                     <a:xfrm>
                       <a:off x="0" y="0"/>
-                      <a:ext cx="5940000" cy="2091397"/>
+                      <a:ext cx="5760000" cy="3514576"/>
                     </a:xfrm>
                     <a:prstGeom prst="rect"/>
                   </pic:spPr>
@@ -2786,7 +3104,7 @@
           <w:b w:val="0"/>
           <w:i w:val="0"/>
         </w:rPr>
-        <w:t>Рисунок 21 – Повна інформація про книги, куплені бібліотекою</w:t>
+        <w:t>Рисунок 27 – Повна інформація про книги, куплені бібліотекою</w:t>
       </w:r>
     </w:p>
     <w:p>

</xml_diff>